<commit_message>
Version 3.9 - Update docs: path-level CSA collateral simulation
</commit_message>
<xml_diff>
--- a/docs/Requirements/PROMETHEUS_FSD.docx
+++ b/docs/Requirements/PROMETHEUS_FSD.docx
@@ -974,6 +974,128 @@
               <w:right w:val="single" w:color="AAAAAA" w:sz="1"/>
             </w:tcBorders>
             <w:shd w:fill="EBF3FB" w:val="clear"/>
+            <w:tcMar>
+              <w:top w:type="dxa" w:w="80"/>
+              <w:left w:type="dxa" w:w="120"/>
+              <w:bottom w:type="dxa" w:w="80"/>
+              <w:right w:type="dxa" w:w="120"/>
+            </w:tcMar>
+          </w:tcPr>
+          <w:p>
+            <w:pPr>
+              <w:spacing w:after="0" w:before="0"/>
+            </w:pPr>
+            <w:r>
+              <w:rPr>
+                <w:b w:val="false"/>
+                <w:bCs w:val="false"/>
+                <w:color w:val="000000"/>
+              </w:rPr>
+            </w:r>
+          </w:p>
+        </w:tc>
+      </w:tr>
+      <w:tr>
+        <w:tc>
+          <w:tcPr>
+            <w:tcW w:type="dxa" w:w="2340"/>
+            <w:tcBorders>
+              <w:top w:val="single" w:color="AAAAAA" w:sz="1"/>
+              <w:left w:val="single" w:color="AAAAAA" w:sz="1"/>
+              <w:bottom w:val="single" w:color="AAAAAA" w:sz="1"/>
+              <w:right w:val="single" w:color="AAAAAA" w:sz="1"/>
+            </w:tcBorders>
+            <w:shd w:fill="FFFFFF" w:val="clear"/>
+            <w:tcMar>
+              <w:top w:type="dxa" w:w="80"/>
+              <w:left w:type="dxa" w:w="120"/>
+              <w:bottom w:type="dxa" w:w="80"/>
+              <w:right w:type="dxa" w:w="120"/>
+            </w:tcMar>
+          </w:tcPr>
+          <w:p>
+            <w:pPr>
+              <w:spacing w:after="0" w:before="0"/>
+            </w:pPr>
+            <w:r>
+              <w:rPr>
+                <w:b w:val="false"/>
+                <w:bCs w:val="false"/>
+                <w:color w:val="000000"/>
+              </w:rPr>
+            </w:r>
+          </w:p>
+        </w:tc>
+        <w:tc>
+          <w:tcPr>
+            <w:tcW w:type="dxa" w:w="2340"/>
+            <w:tcBorders>
+              <w:top w:val="single" w:color="AAAAAA" w:sz="1"/>
+              <w:left w:val="single" w:color="AAAAAA" w:sz="1"/>
+              <w:bottom w:val="single" w:color="AAAAAA" w:sz="1"/>
+              <w:right w:val="single" w:color="AAAAAA" w:sz="1"/>
+            </w:tcBorders>
+            <w:shd w:fill="FFFFFF" w:val="clear"/>
+            <w:tcMar>
+              <w:top w:type="dxa" w:w="80"/>
+              <w:left w:type="dxa" w:w="120"/>
+              <w:bottom w:type="dxa" w:w="80"/>
+              <w:right w:type="dxa" w:w="120"/>
+            </w:tcMar>
+          </w:tcPr>
+          <w:p>
+            <w:pPr>
+              <w:spacing w:after="0" w:before="0"/>
+            </w:pPr>
+            <w:r>
+              <w:rPr>
+                <w:b w:val="false"/>
+                <w:bCs w:val="false"/>
+                <w:color w:val="000000"/>
+              </w:rPr>
+            </w:r>
+          </w:p>
+        </w:tc>
+        <w:tc>
+          <w:tcPr>
+            <w:tcW w:type="dxa" w:w="2340"/>
+            <w:tcBorders>
+              <w:top w:val="single" w:color="AAAAAA" w:sz="1"/>
+              <w:left w:val="single" w:color="AAAAAA" w:sz="1"/>
+              <w:bottom w:val="single" w:color="AAAAAA" w:sz="1"/>
+              <w:right w:val="single" w:color="AAAAAA" w:sz="1"/>
+            </w:tcBorders>
+            <w:shd w:fill="FFFFFF" w:val="clear"/>
+            <w:tcMar>
+              <w:top w:type="dxa" w:w="80"/>
+              <w:left w:type="dxa" w:w="120"/>
+              <w:bottom w:type="dxa" w:w="80"/>
+              <w:right w:type="dxa" w:w="120"/>
+            </w:tcMar>
+          </w:tcPr>
+          <w:p>
+            <w:pPr>
+              <w:spacing w:after="0" w:before="0"/>
+            </w:pPr>
+            <w:r>
+              <w:rPr>
+                <w:b w:val="false"/>
+                <w:bCs w:val="false"/>
+                <w:color w:val="000000"/>
+              </w:rPr>
+            </w:r>
+          </w:p>
+        </w:tc>
+        <w:tc>
+          <w:tcPr>
+            <w:tcW w:type="dxa" w:w="2340"/>
+            <w:tcBorders>
+              <w:top w:val="single" w:color="AAAAAA" w:sz="1"/>
+              <w:left w:val="single" w:color="AAAAAA" w:sz="1"/>
+              <w:bottom w:val="single" w:color="AAAAAA" w:sz="1"/>
+              <w:right w:val="single" w:color="AAAAAA" w:sz="1"/>
+            </w:tcBorders>
+            <w:shd w:fill="FFFFFF" w:val="clear"/>
             <w:tcMar>
               <w:top w:type="dxa" w:w="80"/>
               <w:left w:type="dxa" w:w="120"/>

</xml_diff>